<commit_message>
Update proposal: Peggy Seriès confirmed as Lab Advisor
- Replace TBC lab partner with Prof Peggy Seriès (Chair in
  Computational Psychiatry, University of Edinburgh)
- Strengthen neurodivergent angle in Problem and Solution sections
  (ASD weaker relational priors, anxiety stronger threat priors)
- Add clinical recruitment via Royal Edinburgh Hospital and Dundee
  Ninewells through Seriès lab collaborations
- Update milestones: EEG support mobilised through Edinburgh network
- Section 10: confirmed partnership replaces active outreach language

Co-Authored-By: Claude Opus 4.6 (1M context) <noreply@anthropic.com>
</commit_message>
<xml_diff>
--- a/_bmad-output/planning-artifacts/encode-application/Encode-Fellow-Proposal-Snehal-Nair-2026.docx
+++ b/_bmad-output/planning-artifacts/encode-application/Encode-Fellow-Proposal-Snehal-Nair-2026.docx
@@ -89,17 +89,7 @@
           <w:sz w:val="22"/>
           <w:szCs w:val="22"/>
         </w:rPr>
-        <w:t xml:space="preserve">1) </w:t>
-      </w:r>
-      <w:r>
-        <w:rPr>
-          <w:rFonts w:ascii="Arial" w:cs="Arial" w:eastAsia="Arial" w:hAnsi="Arial"/>
-          <w:b/>
-          <w:bCs/>
-          <w:sz w:val="22"/>
-          <w:szCs w:val="22"/>
-        </w:rPr>
-        <w:t xml:space="preserve">Problem</w:t>
+        <w:t>1) Problem</w:t>
       </w:r>
     </w:p>
     <w:p>
@@ -125,7 +115,7 @@
           <w:sz w:val="22"/>
           <w:szCs w:val="22"/>
         </w:rPr>
-        <w:t xml:space="preserve">To our knowledge, no published NLP system models intent as a dyadic phenomenon conditioned on relational history. Sentiment classifiers measure tone; emotion recognition systems measure affective expression. Neither asks what a person most likely meant, given who they are and who they are talking to. The same message can carry a different intent distribution depending on relationship type, history, and context. The central question is whether conditioning on dyadic context and providing closed-loop feedback measurably improves intent prediction and reduces miscommunication.</w:t>
+        <w:t xml:space="preserve">To our knowledge, no published NLP system models intent as a dyadic phenomenon conditioned on relational history. Sentiment classifiers measure tone; emotion recognition systems measure affective expression. Neither asks what a person most likely meant, given who they are and who they are talking to. The same message can carry a different intent distribution depending on relationship type, history, and context. This divergence may be particularly pronounced in neurodivergent populations: computational psychiatry research suggests that individuals with ASD may form weaker relational priors, while those with anxiety may form stronger threat priors (Sériès, 2020), predicting systematically different intent-gap profiles. The central question is whether conditioning on dyadic context and providing closed-loop feedback measurably improves intent prediction and reduces miscommunication — and whether the effect varies across clinical populations.</w:t>
       </w:r>
     </w:p>
     <w:p>
@@ -225,17 +215,7 @@
           <w:sz w:val="22"/>
           <w:szCs w:val="22"/>
         </w:rPr>
-        <w:t xml:space="preserve">2) </w:t>
-      </w:r>
-      <w:r>
-        <w:rPr>
-          <w:rFonts w:ascii="Arial" w:cs="Arial" w:eastAsia="Arial" w:hAnsi="Arial"/>
-          <w:b/>
-          <w:bCs/>
-          <w:sz w:val="22"/>
-          <w:szCs w:val="22"/>
-        </w:rPr>
-        <w:t xml:space="preserve">Solution</w:t>
+        <w:t>2) Solution</w:t>
       </w:r>
     </w:p>
     <w:p>
@@ -468,7 +448,7 @@
           <w:sz w:val="22"/>
           <w:szCs w:val="22"/>
         </w:rPr>
-        <w:t xml:space="preserve">Each level is independently publishable; null results are pre-registered. A secondary prediction: if sender-receiver divergence arises from asymmetry between subcortical threat-tagging and cortical mentalising, it should be elevated in neurodivergent dyads — tested via stratified analysis.</w:t>
+        <w:t xml:space="preserve">Each level is independently publishable; null results are pre-registered. A key secondary prediction, developed in collaboration with the lab advisor (Sériès lab, computational psychiatry): if sender-receiver divergence arises from asymmetry between subcortical threat-tagging and cortical mentalising, it should be systematically elevated in neurodivergent dyads. Specifically, ASD populations may show weaker relational priors on intent, while anxiety populations may show stronger threat priors — both predicting larger and differently structured intent gaps. This is tested via stratified analysis and directly extends the lab’s existing work on Bayesian inference in clinical populations.</w:t>
       </w:r>
     </w:p>
     <w:p>
@@ -483,17 +463,7 @@
           <w:sz w:val="22"/>
           <w:szCs w:val="22"/>
         </w:rPr>
-        <w:t xml:space="preserve">3) </w:t>
-      </w:r>
-      <w:r>
-        <w:rPr>
-          <w:rFonts w:ascii="Arial" w:cs="Arial" w:eastAsia="Arial" w:hAnsi="Arial"/>
-          <w:b/>
-          <w:bCs/>
-          <w:sz w:val="22"/>
-          <w:szCs w:val="22"/>
-        </w:rPr>
-        <w:t xml:space="preserve">Translation Opportunity</w:t>
+        <w:t>3) Translation Opportunity</w:t>
       </w:r>
     </w:p>
     <w:p>
@@ -1292,7 +1262,7 @@
                 <w:sz w:val="20"/>
                 <w:szCs w:val="20"/>
               </w:rPr>
-              <w:t xml:space="preserve">Lab partner: 64-ch EEG, hyperscanning paradigm, ethics umbrella</w:t>
+              <w:t xml:space="preserve">EEG support via Sériès lab network; ethics umbrella via Edinburgh Informatics</w:t>
             </w:r>
           </w:p>
         </w:tc>
@@ -1636,7 +1606,7 @@
                 <w:sz w:val="20"/>
                 <w:szCs w:val="20"/>
               </w:rPr>
-              <w:t xml:space="preserve">Lab Partner (TBC)</w:t>
+              <w:t xml:space="preserve">Prof Peggy Sériès</w:t>
             </w:r>
           </w:p>
         </w:tc>
@@ -1663,7 +1633,7 @@
                 <w:sz w:val="20"/>
                 <w:szCs w:val="20"/>
               </w:rPr>
-              <w:t xml:space="preserve">Outreach active: UCL FIL, MRC CBU Cambridge, University of Nottingham</w:t>
+              <w:t xml:space="preserve">University of Edinburgh, Chair in Computational Psychiatry, School of Informatics</w:t>
             </w:r>
           </w:p>
         </w:tc>
@@ -1690,7 +1660,7 @@
                 <w:sz w:val="20"/>
                 <w:szCs w:val="20"/>
               </w:rPr>
-              <w:t xml:space="preserve">EEG equipment and lab space, existing hyperscanning paradigm, ethics/IRB umbrella, PI co-authorship. MUST deliverables do not depend on lab partner confirmation</w:t>
+              <w:t xml:space="preserve">Lab Advisor and co-PI. Scientific mentorship on Bayesian inference framing, experimental design for neurodivergent subgroup analysis, and co-authorship. Clinical recruitment via Royal Edinburgh Hospital and Dundee Ninewells collaborations. Can mobilise EEG and hyperscanning support through existing Edinburgh neuroscience network. PhD students working on Bayesian inference in ASD (Angeletos Chrysaitis) and computational psychiatry of anxiety (Ferrari) provide direct collaboration on neurodivergent intent-gap predictions</w:t>
             </w:r>
           </w:p>
         </w:tc>
@@ -1708,17 +1678,7 @@
           <w:sz w:val="22"/>
           <w:szCs w:val="22"/>
         </w:rPr>
-        <w:t xml:space="preserve">5) </w:t>
-      </w:r>
-      <w:r>
-        <w:rPr>
-          <w:rFonts w:ascii="Arial" w:cs="Arial" w:eastAsia="Arial" w:hAnsi="Arial"/>
-          <w:b/>
-          <w:bCs/>
-          <w:sz w:val="22"/>
-          <w:szCs w:val="22"/>
-        </w:rPr>
-        <w:t xml:space="preserve">Data Landscape</w:t>
+        <w:t>5) Data Landscape</w:t>
       </w:r>
     </w:p>
     <w:p>
@@ -1744,7 +1704,7 @@
           <w:sz w:val="22"/>
           <w:szCs w:val="22"/>
         </w:rPr>
-        <w:t xml:space="preserve">Study 1b adds 100 new users under informed consent, with independent raters evaluating held-out messages. Personality data is local-first and encrypted (AES-256). If the EEG pilot proceeds, neural data is collected under joint ethics approval at the lab partner facility.</w:t>
+        <w:t xml:space="preserve">Study 1b adds 100 new users under informed consent, with independent raters evaluating held-out messages. Neurodivergent participants (ASD, anxiety) will be recruited through the lab advisor’s clinical collaborations at Royal Edinburgh Hospital and Dundee Ninewells Hospital, ensuring representation in the annotation and evaluation data. Personality data is local-first and encrypted (AES-256). If the EEG pilot proceeds, neural data is collected under joint ethics approval via the University of Edinburgh.</w:t>
       </w:r>
     </w:p>
     <w:p>
@@ -1759,17 +1719,7 @@
           <w:sz w:val="22"/>
           <w:szCs w:val="22"/>
         </w:rPr>
-        <w:t xml:space="preserve">6) </w:t>
-      </w:r>
-      <w:r>
-        <w:rPr>
-          <w:rFonts w:ascii="Arial" w:cs="Arial" w:eastAsia="Arial" w:hAnsi="Arial"/>
-          <w:b/>
-          <w:bCs/>
-          <w:sz w:val="22"/>
-          <w:szCs w:val="22"/>
-        </w:rPr>
-        <w:t xml:space="preserve">Data Characterisation</w:t>
+        <w:t>6) Data Characterisation</w:t>
       </w:r>
     </w:p>
     <w:p>
@@ -1896,17 +1846,7 @@
           <w:sz w:val="22"/>
           <w:szCs w:val="22"/>
         </w:rPr>
-        <w:t xml:space="preserve">7) </w:t>
-      </w:r>
-      <w:r>
-        <w:rPr>
-          <w:rFonts w:ascii="Arial" w:cs="Arial" w:eastAsia="Arial" w:hAnsi="Arial"/>
-          <w:b/>
-          <w:bCs/>
-          <w:sz w:val="22"/>
-          <w:szCs w:val="22"/>
-        </w:rPr>
-        <w:t xml:space="preserve">Anticipated Failure Modes</w:t>
+        <w:t>7) Anticipated Failure Modes</w:t>
       </w:r>
     </w:p>
     <w:p>
@@ -1947,17 +1887,7 @@
           <w:sz w:val="22"/>
           <w:szCs w:val="22"/>
         </w:rPr>
-        <w:t xml:space="preserve">8) </w:t>
-      </w:r>
-      <w:r>
-        <w:rPr>
-          <w:rFonts w:ascii="Arial" w:cs="Arial" w:eastAsia="Arial" w:hAnsi="Arial"/>
-          <w:b/>
-          <w:bCs/>
-          <w:sz w:val="22"/>
-          <w:szCs w:val="22"/>
-        </w:rPr>
-        <w:t xml:space="preserve">Three Context Papers</w:t>
+        <w:t>8) Three Context Papers</w:t>
       </w:r>
     </w:p>
     <w:p>
@@ -2051,17 +1981,7 @@
           <w:sz w:val="22"/>
           <w:szCs w:val="22"/>
         </w:rPr>
-        <w:t xml:space="preserve">9) </w:t>
-      </w:r>
-      <w:r>
-        <w:rPr>
-          <w:rFonts w:ascii="Arial" w:cs="Arial" w:eastAsia="Arial" w:hAnsi="Arial"/>
-          <w:b/>
-          <w:bCs/>
-          <w:sz w:val="22"/>
-          <w:szCs w:val="22"/>
-        </w:rPr>
-        <w:t xml:space="preserve">ARIA Alignment</w:t>
+        <w:t>9) ARIA Alignment</w:t>
       </w:r>
     </w:p>
     <w:p>
@@ -2125,17 +2045,7 @@
           <w:sz w:val="22"/>
           <w:szCs w:val="22"/>
         </w:rPr>
-        <w:t xml:space="preserve">10) </w:t>
-      </w:r>
-      <w:r>
-        <w:rPr>
-          <w:rFonts w:ascii="Arial" w:cs="Arial" w:eastAsia="Arial" w:hAnsi="Arial"/>
-          <w:b/>
-          <w:bCs/>
-          <w:sz w:val="22"/>
-          <w:szCs w:val="22"/>
-        </w:rPr>
-        <w:t xml:space="preserve">Additional Information</w:t>
+        <w:t>10) Additional Information</w:t>
       </w:r>
     </w:p>
     <w:p>
@@ -2158,7 +2068,7 @@
           <w:sz w:val="22"/>
           <w:szCs w:val="22"/>
         </w:rPr>
-        <w:t xml:space="preserve">I have built and led AI teams at scale (KDD ’24/’25), with a working prototype deployed (dyadicmentalising.streamlit.app) and production experience in NLP and ML systems. The EEG component requires a neuroscience lab partner with an existing hyperscanning paradigm, ethics infrastructure, and theta-band IBS analysis pipeline. MUST-tier deliverables are executable independently; the SHOULD tier is contingent on this partnership.</w:t>
+        <w:t xml:space="preserve">I have built and led AI teams at scale (KDD ’24/’25), with a working prototype deployed (dyadicmentalising.streamlit.app) and production experience in NLP and ML systems. Prof Peggy Sériès (Chair in Computational Psychiatry, University of Edinburgh) has agreed to serve as Lab Advisor, bringing expertise in Bayesian inference, clinical access via Royal Edinburgh Hospital and Dundee Ninewells, and an active research group working on ASD and anxiety. Her lab can mobilise EEG and hyperscanning support through the Edinburgh neuroscience network.</w:t>
       </w:r>
     </w:p>
     <w:p>
@@ -2181,7 +2091,7 @@
           <w:sz w:val="22"/>
           <w:szCs w:val="22"/>
         </w:rPr>
-        <w:t xml:space="preserve">No proprietary datasets required. The primary dependency is lab partner confirmation. Outreach is active (UCL FIL, MRC CBU Cambridge, Nottingham). If not confirmed by Month 3, EEG defers to Year 2 with no impact on core deliverables.</w:t>
+        <w:t xml:space="preserve">No proprietary datasets required. Lab partnership is confirmed (Sériès, Edinburgh). Neurodivergent participant recruitment is supported through existing clinical collaborations at Royal Edinburgh Hospital and Dundee Ninewells. EEG facilities will be mobilised through the Edinburgh neuroscience network.</w:t>
       </w:r>
     </w:p>
     <w:p>

</xml_diff>

<commit_message>
Add neurotypical fallback for ND recruitment contingency
If clinical ND recruitment requires extended ethics approval, study
proceeds with neurotypical participants scored on subclinical trait
measures (AQ-10, GAD-7) — continuous-trait analysis instead of
categorical-group comparison. Added as both data landscape contingency
and explicit failure mode mitigation.

Co-Authored-By: Claude Opus 4.6 (1M context) <noreply@anthropic.com>
</commit_message>
<xml_diff>
--- a/_bmad-output/planning-artifacts/encode-application/Encode-Fellow-Proposal-Snehal-Nair-2026.docx
+++ b/_bmad-output/planning-artifacts/encode-application/Encode-Fellow-Proposal-Snehal-Nair-2026.docx
@@ -1704,7 +1704,7 @@
           <w:sz w:val="22"/>
           <w:szCs w:val="22"/>
         </w:rPr>
-        <w:t xml:space="preserve">Study 1b adds 100 new users under informed consent, with independent raters evaluating held-out messages. Neurodivergent participants (ASD, anxiety) will be recruited through the lab advisor’s clinical collaborations at Royal Edinburgh Hospital and Dundee Ninewells Hospital, ensuring representation in the annotation and evaluation data. Personality data is local-first and encrypted (AES-256). If the EEG pilot proceeds, neural data is collected under joint ethics approval via the University of Edinburgh.</w:t>
+        <w:t xml:space="preserve">Study 1b adds 100 new users under informed consent, with independent raters evaluating held-out messages. Neurodivergent participants (ASD, anxiety) will be recruited through the lab advisor’s clinical collaborations at Royal Edinburgh Hospital and Dundee Ninewells Hospital. If clinical recruitment requires additional ethics approval or extended timelines, the study will proceed with neurotypical participants who exhibit subclinical variation on standard trait measures (e.g., AQ-10, GAD-7), preserving the ability to test whether intent-gap profiles vary with trait-level differences on the autism and anxiety spectra. Personality data is local-first and encrypted (AES-256). If the EEG pilot proceeds, neural data is collected under joint ethics approval via the University of Edinburgh.</w:t>
       </w:r>
     </w:p>
     <w:p>
@@ -1872,7 +1872,7 @@
           <w:sz w:val="22"/>
           <w:szCs w:val="22"/>
         </w:rPr>
-        <w:t xml:space="preserve">A second risk is a null H₁ result — still publishable as the first rigorous test of whether dyadic context improves intent prediction at this scale.</w:t>
+        <w:t xml:space="preserve">A second risk is a null H₁ result — still publishable as the first rigorous test of whether dyadic context improves intent prediction at this scale. A third risk is delayed ethics approval for clinical neurodivergent recruitment. This is mitigated by a fallback to neurotypical participants scored on subclinical trait measures (AQ-10, GAD-7), allowing the neurodivergent analysis to proceed as a continuous-trait study rather than a categorical-group comparison.</w:t>
       </w:r>
     </w:p>
     <w:p>

</xml_diff>

<commit_message>
Proposal v3: ND two-tier design, Pellicano & Burr, orange borders
Content changes:
- Foreshadow trait-level (AQ-10, GAD-7) fallback in Section 1
- Remove "browser extension" → "intervention instrument" in Section 2
- Add categorical + trait-level dual testing in Section 2 ND prediction
- Add Bayesian testbed framing linking to Sériès lab
- Expand Section 3 with FRO language and comp psych translation
- Strengthen EEG resource wording in Section 4
- Add trait-level scientific justification in Section 5
- Reframe Section 7 from "fallback" to "two-tier design"
- Swap Schrimpf for Pellicano & Burr (2012) in Section 8
- Add demo description in Section 10
- Add "trait-level" to Peggy's involvement description

Format changes:
- Orange (#FF4F1F) top borders on tables matching template
- Light grey (#CCCCCC) internal borders

Co-Authored-By: Claude Opus 4.6 (1M context) <noreply@anthropic.com>
</commit_message>
<xml_diff>
--- a/_bmad-output/planning-artifacts/encode-application/Encode-Fellow-Proposal-Snehal-Nair-2026.docx
+++ b/_bmad-output/planning-artifacts/encode-application/Encode-Fellow-Proposal-Snehal-Nair-2026.docx
@@ -115,7 +115,7 @@
           <w:sz w:val="22"/>
           <w:szCs w:val="22"/>
         </w:rPr>
-        <w:t xml:space="preserve">To our knowledge, no published NLP system models intent as a dyadic phenomenon conditioned on relational history. Sentiment classifiers measure tone; emotion recognition systems measure affective expression. Neither asks what a person most likely meant, given who they are and who they are talking to. The same message can carry a different intent distribution depending on relationship type, history, and context. This divergence may be particularly pronounced in neurodivergent populations: computational psychiatry research suggests that individuals with ASD may form weaker relational priors, while those with anxiety may form stronger threat priors (Sériès, 2020), predicting systematically different intent-gap profiles. The central question is whether conditioning on dyadic context and providing closed-loop feedback measurably improves intent prediction and reduces miscommunication — and whether the effect varies across clinical populations.</w:t>
+        <w:t xml:space="preserve">To our knowledge, no published NLP system models intent as a dyadic phenomenon conditioned on relational history. Sentiment classifiers measure tone; emotion recognition systems measure affective expression. Neither asks what a person most likely meant, given who they are and who they are talking to. The same message can carry a different intent distribution depending on relationship type, history, and context. This divergence may be particularly pronounced in neurodivergent populations: computational psychiatry research suggests that individuals with ASD may form weaker relational priors, while those with anxiety may form stronger threat priors (Sériès, 2020), predicting systematically different intent-gap profiles. Where full clinical recruitment is not yet feasible, we treat autistic and anxious traits as continuous dimensions in a neurotypical sample, testing the same predictions at the trait level (AQ-10, GAD-7). The central question is whether conditioning on dyadic context and providing closed-loop feedback measurably improves intent prediction and reduces miscommunication — and whether the effect varies with neurodivergent traits and clinical status.</w:t>
       </w:r>
     </w:p>
     <w:p>
@@ -310,7 +310,7 @@
           <w:sz w:val="22"/>
           <w:szCs w:val="22"/>
         </w:rPr>
-        <w:t xml:space="preserve">A browser extension surfaces the model’s predicted intent in the pause between reading a message and replying, providing an alternative interpretation before the receiver forms a response.</w:t>
+        <w:t xml:space="preserve">The intervention instrument delivers the model’s predicted intent during the natural pause between reading a message and replying, providing an alternative interpretation before the receiver commits to a threat-based reading.</w:t>
       </w:r>
     </w:p>
     <w:p>
@@ -435,7 +435,7 @@
           <w:sz w:val="22"/>
           <w:szCs w:val="22"/>
         </w:rPr>
-        <w:t xml:space="preserve">60-day feedback increases theta-band inter-brain synchrony (EEG hyperscanning, N=20–24, pre/post).</w:t>
+        <w:t xml:space="preserve">60-day feedback increases theta-band inter-brain synchrony (EEG hyperscanning, N=20–24, pre/post, via Edinburgh neuroscience network coordinated by Sériès lab).</w:t>
       </w:r>
     </w:p>
     <w:p>
@@ -448,7 +448,7 @@
           <w:sz w:val="22"/>
           <w:szCs w:val="22"/>
         </w:rPr>
-        <w:t xml:space="preserve">Each level is independently publishable; null results are pre-registered. A key secondary prediction, developed in collaboration with the lab advisor (Sériès lab, computational psychiatry): if sender-receiver divergence arises from asymmetry between subcortical threat-tagging and cortical mentalising, it should be systematically elevated in neurodivergent dyads. Specifically, ASD populations may show weaker relational priors on intent, while anxiety populations may show stronger threat priors — both predicting larger and differently structured intent gaps. This is tested via stratified analysis and directly extends the lab’s existing work on Bayesian inference in clinical populations.</w:t>
+        <w:t xml:space="preserve">Each level is independently publishable; null results are pre-registered. A key secondary prediction, developed in collaboration with the lab advisor (Sériès lab, computational psychiatry): if sender-receiver divergence arises from asymmetry between subcortical threat-tagging and cortical mentalising, it should be systematically elevated in neurodivergent dyads. Specifically, ASD populations may show weaker relational priors on intent, while anxiety populations may show stronger threat priors — both predicting larger and differently structured intent gaps. This will be tested both in categorical clinical subsamples (where recruitment and ethics permit) and, as a primary approach, along continuous trait measures (AQ-10, GAD-7) in a broader sample. In collaboration with Sériès lab, this becomes a concrete testbed for Bayesian theories of ASD and anxiety applied to everyday communication rather than laboratory stimuli.</w:t>
       </w:r>
     </w:p>
     <w:p>
@@ -476,7 +476,7 @@
           <w:sz w:val="22"/>
           <w:szCs w:val="22"/>
         </w:rPr>
-        <w:t xml:space="preserve">The scientific contribution is a new measurement construct — the divergence between sender-intent and perceived-intent distributions — and a new conditioning signal: dyadic relational context. The open-source dataset and trained model (HuggingFace, Apache 2.0) will support follow-on research in pragmatic inference, social cognition, and human-AI communication. Longer-term translation may include consent-gated relational tools, but that is explicitly downstream of the scientific validation.</w:t>
+        <w:t xml:space="preserve">The scientific contribution is a new measurement construct — the divergence between sender-intent and perceived-intent distributions — and a new conditioning signal: dyadic relational context. The open-source dataset and trained model (HuggingFace, Apache 2.0) will support follow-on research in pragmatic inference, social cognition, and human-AI communication. If the intent gap proves measurable and reducible, the open-source instrument could anchor a Focused Research Organisation dedicated to communication measurement. For computational psychiatry, the same tools provide a controlled way to study how autistic and anxious traits shape intent inference, potentially informing future clinical interventions even if Year-1 work remains pre-clinical.</w:t>
       </w:r>
     </w:p>
     <w:p>
@@ -557,12 +557,12 @@
       <w:tblPr>
         <w:tblW w:type="dxa" w:w="9026"/>
         <w:tblBorders>
-          <w:top w:val="single" w:color="auto" w:sz="4"/>
-          <w:left w:val="single" w:color="auto" w:sz="4"/>
-          <w:bottom w:val="single" w:color="auto" w:sz="4"/>
-          <w:right w:val="single" w:color="auto" w:sz="4"/>
-          <w:insideH w:val="single" w:color="auto" w:sz="4"/>
-          <w:insideV w:val="single" w:color="auto" w:sz="4"/>
+          <w:top w:val="single" w:color="FF4F1F" w:sz="8"/>
+          <w:left w:val="single" w:color="CCCCCC" w:sz="4"/>
+          <w:bottom w:val="single" w:color="CCCCCC" w:sz="4"/>
+          <w:right w:val="single" w:color="CCCCCC" w:sz="4"/>
+          <w:insideH w:val="single" w:color="CCCCCC" w:sz="4"/>
+          <w:insideV w:val="single" w:color="CCCCCC" w:sz="4"/>
         </w:tblBorders>
       </w:tblPr>
       <w:tblGrid>
@@ -575,10 +575,10 @@
           <w:tcPr>
             <w:tcW w:type="dxa" w:w="2400"/>
             <w:tcBorders>
-              <w:top w:val="single" w:color="000000" w:sz="6"/>
-              <w:left w:val="single" w:color="000000" w:sz="6"/>
-              <w:bottom w:val="single" w:color="000000" w:sz="6"/>
-              <w:right w:val="single" w:color="000000" w:sz="6"/>
+              <w:top w:val="single" w:color="FF4F1F" w:sz="8"/>
+              <w:left w:val="single" w:color="CCCCCC" w:sz="4"/>
+              <w:bottom w:val="single" w:color="CCCCCC" w:sz="4"/>
+              <w:right w:val="single" w:color="CCCCCC" w:sz="4"/>
             </w:tcBorders>
             <w:shd w:fill="E8ECF0" w:val="clear"/>
             <w:tcMar>
@@ -617,10 +617,10 @@
           <w:tcPr>
             <w:tcW w:type="dxa" w:w="3826"/>
             <w:tcBorders>
-              <w:top w:val="single" w:color="000000" w:sz="6"/>
-              <w:left w:val="single" w:color="000000" w:sz="6"/>
-              <w:bottom w:val="single" w:color="000000" w:sz="6"/>
-              <w:right w:val="single" w:color="000000" w:sz="6"/>
+              <w:top w:val="single" w:color="FF4F1F" w:sz="8"/>
+              <w:left w:val="single" w:color="CCCCCC" w:sz="4"/>
+              <w:bottom w:val="single" w:color="CCCCCC" w:sz="4"/>
+              <w:right w:val="single" w:color="CCCCCC" w:sz="4"/>
             </w:tcBorders>
             <w:shd w:fill="E8ECF0" w:val="clear"/>
             <w:tcMar>
@@ -659,10 +659,10 @@
           <w:tcPr>
             <w:tcW w:type="dxa" w:w="2800"/>
             <w:tcBorders>
-              <w:top w:val="single" w:color="000000" w:sz="6"/>
-              <w:left w:val="single" w:color="000000" w:sz="6"/>
-              <w:bottom w:val="single" w:color="000000" w:sz="6"/>
-              <w:right w:val="single" w:color="000000" w:sz="6"/>
+              <w:top w:val="single" w:color="FF4F1F" w:sz="8"/>
+              <w:left w:val="single" w:color="CCCCCC" w:sz="4"/>
+              <w:bottom w:val="single" w:color="CCCCCC" w:sz="4"/>
+              <w:right w:val="single" w:color="CCCCCC" w:sz="4"/>
             </w:tcBorders>
             <w:shd w:fill="E8ECF0" w:val="clear"/>
             <w:tcMar>
@@ -703,10 +703,10 @@
           <w:tcPr>
             <w:tcW w:type="dxa" w:w="2400"/>
             <w:tcBorders>
-              <w:top w:val="single" w:color="000000" w:sz="6"/>
-              <w:left w:val="single" w:color="000000" w:sz="6"/>
-              <w:bottom w:val="single" w:color="000000" w:sz="6"/>
-              <w:right w:val="single" w:color="000000" w:sz="6"/>
+              <w:top w:val="single" w:color="FF4F1F" w:sz="8"/>
+              <w:left w:val="single" w:color="CCCCCC" w:sz="4"/>
+              <w:bottom w:val="single" w:color="CCCCCC" w:sz="4"/>
+              <w:right w:val="single" w:color="CCCCCC" w:sz="4"/>
             </w:tcBorders>
             <w:tcMar>
               <w:top w:type="dxa" w:w="60"/>
@@ -740,10 +740,10 @@
           <w:tcPr>
             <w:tcW w:type="dxa" w:w="3826"/>
             <w:tcBorders>
-              <w:top w:val="single" w:color="000000" w:sz="6"/>
-              <w:left w:val="single" w:color="000000" w:sz="6"/>
-              <w:bottom w:val="single" w:color="000000" w:sz="6"/>
-              <w:right w:val="single" w:color="000000" w:sz="6"/>
+              <w:top w:val="single" w:color="FF4F1F" w:sz="8"/>
+              <w:left w:val="single" w:color="CCCCCC" w:sz="4"/>
+              <w:bottom w:val="single" w:color="CCCCCC" w:sz="4"/>
+              <w:right w:val="single" w:color="CCCCCC" w:sz="4"/>
             </w:tcBorders>
             <w:tcMar>
               <w:top w:type="dxa" w:w="60"/>
@@ -777,10 +777,10 @@
           <w:tcPr>
             <w:tcW w:type="dxa" w:w="2800"/>
             <w:tcBorders>
-              <w:top w:val="single" w:color="000000" w:sz="6"/>
-              <w:left w:val="single" w:color="000000" w:sz="6"/>
-              <w:bottom w:val="single" w:color="000000" w:sz="6"/>
-              <w:right w:val="single" w:color="000000" w:sz="6"/>
+              <w:top w:val="single" w:color="FF4F1F" w:sz="8"/>
+              <w:left w:val="single" w:color="CCCCCC" w:sz="4"/>
+              <w:bottom w:val="single" w:color="CCCCCC" w:sz="4"/>
+              <w:right w:val="single" w:color="CCCCCC" w:sz="4"/>
             </w:tcBorders>
             <w:tcMar>
               <w:top w:type="dxa" w:w="60"/>
@@ -806,10 +806,10 @@
           <w:tcPr>
             <w:tcW w:type="dxa" w:w="2400"/>
             <w:tcBorders>
-              <w:top w:val="single" w:color="000000" w:sz="6"/>
-              <w:left w:val="single" w:color="000000" w:sz="6"/>
-              <w:bottom w:val="single" w:color="000000" w:sz="6"/>
-              <w:right w:val="single" w:color="000000" w:sz="6"/>
+              <w:top w:val="single" w:color="FF4F1F" w:sz="8"/>
+              <w:left w:val="single" w:color="CCCCCC" w:sz="4"/>
+              <w:bottom w:val="single" w:color="CCCCCC" w:sz="4"/>
+              <w:right w:val="single" w:color="CCCCCC" w:sz="4"/>
             </w:tcBorders>
             <w:tcMar>
               <w:top w:type="dxa" w:w="60"/>
@@ -843,10 +843,10 @@
           <w:tcPr>
             <w:tcW w:type="dxa" w:w="3826"/>
             <w:tcBorders>
-              <w:top w:val="single" w:color="000000" w:sz="6"/>
-              <w:left w:val="single" w:color="000000" w:sz="6"/>
-              <w:bottom w:val="single" w:color="000000" w:sz="6"/>
-              <w:right w:val="single" w:color="000000" w:sz="6"/>
+              <w:top w:val="single" w:color="FF4F1F" w:sz="8"/>
+              <w:left w:val="single" w:color="CCCCCC" w:sz="4"/>
+              <w:bottom w:val="single" w:color="CCCCCC" w:sz="4"/>
+              <w:right w:val="single" w:color="CCCCCC" w:sz="4"/>
             </w:tcBorders>
             <w:tcMar>
               <w:top w:type="dxa" w:w="60"/>
@@ -880,10 +880,10 @@
           <w:tcPr>
             <w:tcW w:type="dxa" w:w="2800"/>
             <w:tcBorders>
-              <w:top w:val="single" w:color="000000" w:sz="6"/>
-              <w:left w:val="single" w:color="000000" w:sz="6"/>
-              <w:bottom w:val="single" w:color="000000" w:sz="6"/>
-              <w:right w:val="single" w:color="000000" w:sz="6"/>
+              <w:top w:val="single" w:color="FF4F1F" w:sz="8"/>
+              <w:left w:val="single" w:color="CCCCCC" w:sz="4"/>
+              <w:bottom w:val="single" w:color="CCCCCC" w:sz="4"/>
+              <w:right w:val="single" w:color="CCCCCC" w:sz="4"/>
             </w:tcBorders>
             <w:tcMar>
               <w:top w:type="dxa" w:w="60"/>
@@ -909,10 +909,10 @@
           <w:tcPr>
             <w:tcW w:type="dxa" w:w="2400"/>
             <w:tcBorders>
-              <w:top w:val="single" w:color="000000" w:sz="6"/>
-              <w:left w:val="single" w:color="000000" w:sz="6"/>
-              <w:bottom w:val="single" w:color="000000" w:sz="6"/>
-              <w:right w:val="single" w:color="000000" w:sz="6"/>
+              <w:top w:val="single" w:color="FF4F1F" w:sz="8"/>
+              <w:left w:val="single" w:color="CCCCCC" w:sz="4"/>
+              <w:bottom w:val="single" w:color="CCCCCC" w:sz="4"/>
+              <w:right w:val="single" w:color="CCCCCC" w:sz="4"/>
             </w:tcBorders>
             <w:tcMar>
               <w:top w:type="dxa" w:w="60"/>
@@ -946,10 +946,10 @@
           <w:tcPr>
             <w:tcW w:type="dxa" w:w="3826"/>
             <w:tcBorders>
-              <w:top w:val="single" w:color="000000" w:sz="6"/>
-              <w:left w:val="single" w:color="000000" w:sz="6"/>
-              <w:bottom w:val="single" w:color="000000" w:sz="6"/>
-              <w:right w:val="single" w:color="000000" w:sz="6"/>
+              <w:top w:val="single" w:color="FF4F1F" w:sz="8"/>
+              <w:left w:val="single" w:color="CCCCCC" w:sz="4"/>
+              <w:bottom w:val="single" w:color="CCCCCC" w:sz="4"/>
+              <w:right w:val="single" w:color="CCCCCC" w:sz="4"/>
             </w:tcBorders>
             <w:tcMar>
               <w:top w:type="dxa" w:w="60"/>
@@ -1001,10 +1001,10 @@
           <w:tcPr>
             <w:tcW w:type="dxa" w:w="2800"/>
             <w:tcBorders>
-              <w:top w:val="single" w:color="000000" w:sz="6"/>
-              <w:left w:val="single" w:color="000000" w:sz="6"/>
-              <w:bottom w:val="single" w:color="000000" w:sz="6"/>
-              <w:right w:val="single" w:color="000000" w:sz="6"/>
+              <w:top w:val="single" w:color="FF4F1F" w:sz="8"/>
+              <w:left w:val="single" w:color="CCCCCC" w:sz="4"/>
+              <w:bottom w:val="single" w:color="CCCCCC" w:sz="4"/>
+              <w:right w:val="single" w:color="CCCCCC" w:sz="4"/>
             </w:tcBorders>
             <w:tcMar>
               <w:top w:type="dxa" w:w="60"/>
@@ -1030,10 +1030,10 @@
           <w:tcPr>
             <w:tcW w:type="dxa" w:w="2400"/>
             <w:tcBorders>
-              <w:top w:val="single" w:color="000000" w:sz="6"/>
-              <w:left w:val="single" w:color="000000" w:sz="6"/>
-              <w:bottom w:val="single" w:color="000000" w:sz="6"/>
-              <w:right w:val="single" w:color="000000" w:sz="6"/>
+              <w:top w:val="single" w:color="FF4F1F" w:sz="8"/>
+              <w:left w:val="single" w:color="CCCCCC" w:sz="4"/>
+              <w:bottom w:val="single" w:color="CCCCCC" w:sz="4"/>
+              <w:right w:val="single" w:color="CCCCCC" w:sz="4"/>
             </w:tcBorders>
             <w:tcMar>
               <w:top w:type="dxa" w:w="60"/>
@@ -1067,10 +1067,10 @@
           <w:tcPr>
             <w:tcW w:type="dxa" w:w="3826"/>
             <w:tcBorders>
-              <w:top w:val="single" w:color="000000" w:sz="6"/>
-              <w:left w:val="single" w:color="000000" w:sz="6"/>
-              <w:bottom w:val="single" w:color="000000" w:sz="6"/>
-              <w:right w:val="single" w:color="000000" w:sz="6"/>
+              <w:top w:val="single" w:color="FF4F1F" w:sz="8"/>
+              <w:left w:val="single" w:color="CCCCCC" w:sz="4"/>
+              <w:bottom w:val="single" w:color="CCCCCC" w:sz="4"/>
+              <w:right w:val="single" w:color="CCCCCC" w:sz="4"/>
             </w:tcBorders>
             <w:tcMar>
               <w:top w:type="dxa" w:w="60"/>
@@ -1104,10 +1104,10 @@
           <w:tcPr>
             <w:tcW w:type="dxa" w:w="2800"/>
             <w:tcBorders>
-              <w:top w:val="single" w:color="000000" w:sz="6"/>
-              <w:left w:val="single" w:color="000000" w:sz="6"/>
-              <w:bottom w:val="single" w:color="000000" w:sz="6"/>
-              <w:right w:val="single" w:color="000000" w:sz="6"/>
+              <w:top w:val="single" w:color="FF4F1F" w:sz="8"/>
+              <w:left w:val="single" w:color="CCCCCC" w:sz="4"/>
+              <w:bottom w:val="single" w:color="CCCCCC" w:sz="4"/>
+              <w:right w:val="single" w:color="CCCCCC" w:sz="4"/>
             </w:tcBorders>
             <w:tcMar>
               <w:top w:type="dxa" w:w="60"/>
@@ -1133,10 +1133,10 @@
           <w:tcPr>
             <w:tcW w:type="dxa" w:w="2400"/>
             <w:tcBorders>
-              <w:top w:val="single" w:color="000000" w:sz="6"/>
-              <w:left w:val="single" w:color="000000" w:sz="6"/>
-              <w:bottom w:val="single" w:color="000000" w:sz="6"/>
-              <w:right w:val="single" w:color="000000" w:sz="6"/>
+              <w:top w:val="single" w:color="FF4F1F" w:sz="8"/>
+              <w:left w:val="single" w:color="CCCCCC" w:sz="4"/>
+              <w:bottom w:val="single" w:color="CCCCCC" w:sz="4"/>
+              <w:right w:val="single" w:color="CCCCCC" w:sz="4"/>
             </w:tcBorders>
             <w:tcMar>
               <w:top w:type="dxa" w:w="60"/>
@@ -1170,10 +1170,10 @@
           <w:tcPr>
             <w:tcW w:type="dxa" w:w="3826"/>
             <w:tcBorders>
-              <w:top w:val="single" w:color="000000" w:sz="6"/>
-              <w:left w:val="single" w:color="000000" w:sz="6"/>
-              <w:bottom w:val="single" w:color="000000" w:sz="6"/>
-              <w:right w:val="single" w:color="000000" w:sz="6"/>
+              <w:top w:val="single" w:color="FF4F1F" w:sz="8"/>
+              <w:left w:val="single" w:color="CCCCCC" w:sz="4"/>
+              <w:bottom w:val="single" w:color="CCCCCC" w:sz="4"/>
+              <w:right w:val="single" w:color="CCCCCC" w:sz="4"/>
             </w:tcBorders>
             <w:tcMar>
               <w:top w:type="dxa" w:w="60"/>
@@ -1243,26 +1243,26 @@
           <w:tcPr>
             <w:tcW w:type="dxa" w:w="2800"/>
             <w:tcBorders>
-              <w:top w:val="single" w:color="000000" w:sz="6"/>
-              <w:left w:val="single" w:color="000000" w:sz="6"/>
-              <w:bottom w:val="single" w:color="000000" w:sz="6"/>
-              <w:right w:val="single" w:color="000000" w:sz="6"/>
-            </w:tcBorders>
-            <w:tcMar>
-              <w:top w:type="dxa" w:w="60"/>
-              <w:left w:type="dxa" w:w="80"/>
-              <w:bottom w:type="dxa" w:w="60"/>
-              <w:right w:type="dxa" w:w="80"/>
-            </w:tcMar>
-          </w:tcPr>
-          <w:p>
-            <w:r>
-              <w:rPr>
-                <w:rFonts w:ascii="Arial" w:cs="Arial" w:eastAsia="Arial" w:hAnsi="Arial"/>
-                <w:sz w:val="20"/>
-                <w:szCs w:val="20"/>
-              </w:rPr>
-              <w:t xml:space="preserve">EEG support via Sériès lab network; ethics umbrella via Edinburgh Informatics</w:t>
+              <w:top w:val="single" w:color="FF4F1F" w:sz="8"/>
+              <w:left w:val="single" w:color="CCCCCC" w:sz="4"/>
+              <w:bottom w:val="single" w:color="CCCCCC" w:sz="4"/>
+              <w:right w:val="single" w:color="CCCCCC" w:sz="4"/>
+            </w:tcBorders>
+            <w:tcMar>
+              <w:top w:type="dxa" w:w="60"/>
+              <w:left w:type="dxa" w:w="80"/>
+              <w:bottom w:type="dxa" w:w="60"/>
+              <w:right w:type="dxa" w:w="80"/>
+            </w:tcMar>
+          </w:tcPr>
+          <w:p>
+            <w:r>
+              <w:rPr>
+                <w:rFonts w:ascii="Arial" w:cs="Arial" w:eastAsia="Arial" w:hAnsi="Arial"/>
+                <w:sz w:val="20"/>
+                <w:szCs w:val="20"/>
+              </w:rPr>
+              <w:t xml:space="preserve">EEG and hyperscanning support via Sériès lab’s existing Edinburgh neuroscience collaborations; ethics umbrella via Edinburgh Informatics and clinical partners</w:t>
             </w:r>
           </w:p>
         </w:tc>
@@ -1272,10 +1272,10 @@
           <w:tcPr>
             <w:tcW w:type="dxa" w:w="2400"/>
             <w:tcBorders>
-              <w:top w:val="single" w:color="000000" w:sz="6"/>
-              <w:left w:val="single" w:color="000000" w:sz="6"/>
-              <w:bottom w:val="single" w:color="000000" w:sz="6"/>
-              <w:right w:val="single" w:color="000000" w:sz="6"/>
+              <w:top w:val="single" w:color="FF4F1F" w:sz="8"/>
+              <w:left w:val="single" w:color="CCCCCC" w:sz="4"/>
+              <w:bottom w:val="single" w:color="CCCCCC" w:sz="4"/>
+              <w:right w:val="single" w:color="CCCCCC" w:sz="4"/>
             </w:tcBorders>
             <w:tcMar>
               <w:top w:type="dxa" w:w="60"/>
@@ -1309,10 +1309,10 @@
           <w:tcPr>
             <w:tcW w:type="dxa" w:w="3826"/>
             <w:tcBorders>
-              <w:top w:val="single" w:color="000000" w:sz="6"/>
-              <w:left w:val="single" w:color="000000" w:sz="6"/>
-              <w:bottom w:val="single" w:color="000000" w:sz="6"/>
-              <w:right w:val="single" w:color="000000" w:sz="6"/>
+              <w:top w:val="single" w:color="FF4F1F" w:sz="8"/>
+              <w:left w:val="single" w:color="CCCCCC" w:sz="4"/>
+              <w:bottom w:val="single" w:color="CCCCCC" w:sz="4"/>
+              <w:right w:val="single" w:color="CCCCCC" w:sz="4"/>
             </w:tcBorders>
             <w:tcMar>
               <w:top w:type="dxa" w:w="60"/>
@@ -1346,10 +1346,10 @@
           <w:tcPr>
             <w:tcW w:type="dxa" w:w="2800"/>
             <w:tcBorders>
-              <w:top w:val="single" w:color="000000" w:sz="6"/>
-              <w:left w:val="single" w:color="000000" w:sz="6"/>
-              <w:bottom w:val="single" w:color="000000" w:sz="6"/>
-              <w:right w:val="single" w:color="000000" w:sz="6"/>
+              <w:top w:val="single" w:color="FF4F1F" w:sz="8"/>
+              <w:left w:val="single" w:color="CCCCCC" w:sz="4"/>
+              <w:bottom w:val="single" w:color="CCCCCC" w:sz="4"/>
+              <w:right w:val="single" w:color="CCCCCC" w:sz="4"/>
             </w:tcBorders>
             <w:tcMar>
               <w:top w:type="dxa" w:w="60"/>
@@ -1390,12 +1390,12 @@
       <w:tblPr>
         <w:tblW w:type="dxa" w:w="9026"/>
         <w:tblBorders>
-          <w:top w:val="single" w:color="auto" w:sz="4"/>
-          <w:left w:val="single" w:color="auto" w:sz="4"/>
-          <w:bottom w:val="single" w:color="auto" w:sz="4"/>
-          <w:right w:val="single" w:color="auto" w:sz="4"/>
-          <w:insideH w:val="single" w:color="auto" w:sz="4"/>
-          <w:insideV w:val="single" w:color="auto" w:sz="4"/>
+          <w:top w:val="single" w:color="FF4F1F" w:sz="8"/>
+          <w:left w:val="single" w:color="CCCCCC" w:sz="4"/>
+          <w:bottom w:val="single" w:color="CCCCCC" w:sz="4"/>
+          <w:right w:val="single" w:color="CCCCCC" w:sz="4"/>
+          <w:insideH w:val="single" w:color="CCCCCC" w:sz="4"/>
+          <w:insideV w:val="single" w:color="CCCCCC" w:sz="4"/>
         </w:tblBorders>
       </w:tblPr>
       <w:tblGrid>
@@ -1408,10 +1408,10 @@
           <w:tcPr>
             <w:tcW w:type="dxa" w:w="2000"/>
             <w:tcBorders>
-              <w:top w:val="single" w:color="000000" w:sz="6"/>
-              <w:left w:val="single" w:color="000000" w:sz="6"/>
-              <w:bottom w:val="single" w:color="000000" w:sz="6"/>
-              <w:right w:val="single" w:color="000000" w:sz="6"/>
+              <w:top w:val="single" w:color="FF4F1F" w:sz="8"/>
+              <w:left w:val="single" w:color="CCCCCC" w:sz="4"/>
+              <w:bottom w:val="single" w:color="CCCCCC" w:sz="4"/>
+              <w:right w:val="single" w:color="CCCCCC" w:sz="4"/>
             </w:tcBorders>
             <w:shd w:fill="E8ECF0" w:val="clear"/>
             <w:tcMar>
@@ -1438,10 +1438,10 @@
           <w:tcPr>
             <w:tcW w:type="dxa" w:w="2513"/>
             <w:tcBorders>
-              <w:top w:val="single" w:color="000000" w:sz="6"/>
-              <w:left w:val="single" w:color="000000" w:sz="6"/>
-              <w:bottom w:val="single" w:color="000000" w:sz="6"/>
-              <w:right w:val="single" w:color="000000" w:sz="6"/>
+              <w:top w:val="single" w:color="FF4F1F" w:sz="8"/>
+              <w:left w:val="single" w:color="CCCCCC" w:sz="4"/>
+              <w:bottom w:val="single" w:color="CCCCCC" w:sz="4"/>
+              <w:right w:val="single" w:color="CCCCCC" w:sz="4"/>
             </w:tcBorders>
             <w:shd w:fill="E8ECF0" w:val="clear"/>
             <w:tcMar>
@@ -1468,10 +1468,10 @@
           <w:tcPr>
             <w:tcW w:type="dxa" w:w="4513"/>
             <w:tcBorders>
-              <w:top w:val="single" w:color="000000" w:sz="6"/>
-              <w:left w:val="single" w:color="000000" w:sz="6"/>
-              <w:bottom w:val="single" w:color="000000" w:sz="6"/>
-              <w:right w:val="single" w:color="000000" w:sz="6"/>
+              <w:top w:val="single" w:color="FF4F1F" w:sz="8"/>
+              <w:left w:val="single" w:color="CCCCCC" w:sz="4"/>
+              <w:bottom w:val="single" w:color="CCCCCC" w:sz="4"/>
+              <w:right w:val="single" w:color="CCCCCC" w:sz="4"/>
             </w:tcBorders>
             <w:shd w:fill="E8ECF0" w:val="clear"/>
             <w:tcMar>
@@ -1500,10 +1500,10 @@
           <w:tcPr>
             <w:tcW w:type="dxa" w:w="2000"/>
             <w:tcBorders>
-              <w:top w:val="single" w:color="000000" w:sz="6"/>
-              <w:left w:val="single" w:color="000000" w:sz="6"/>
-              <w:bottom w:val="single" w:color="000000" w:sz="6"/>
-              <w:right w:val="single" w:color="000000" w:sz="6"/>
+              <w:top w:val="single" w:color="FF4F1F" w:sz="8"/>
+              <w:left w:val="single" w:color="CCCCCC" w:sz="4"/>
+              <w:bottom w:val="single" w:color="CCCCCC" w:sz="4"/>
+              <w:right w:val="single" w:color="CCCCCC" w:sz="4"/>
             </w:tcBorders>
             <w:tcMar>
               <w:top w:type="dxa" w:w="60"/>
@@ -1529,10 +1529,10 @@
           <w:tcPr>
             <w:tcW w:type="dxa" w:w="2513"/>
             <w:tcBorders>
-              <w:top w:val="single" w:color="000000" w:sz="6"/>
-              <w:left w:val="single" w:color="000000" w:sz="6"/>
-              <w:bottom w:val="single" w:color="000000" w:sz="6"/>
-              <w:right w:val="single" w:color="000000" w:sz="6"/>
+              <w:top w:val="single" w:color="FF4F1F" w:sz="8"/>
+              <w:left w:val="single" w:color="CCCCCC" w:sz="4"/>
+              <w:bottom w:val="single" w:color="CCCCCC" w:sz="4"/>
+              <w:right w:val="single" w:color="CCCCCC" w:sz="4"/>
             </w:tcBorders>
             <w:tcMar>
               <w:top w:type="dxa" w:w="60"/>
@@ -1556,10 +1556,10 @@
           <w:tcPr>
             <w:tcW w:type="dxa" w:w="4513"/>
             <w:tcBorders>
-              <w:top w:val="single" w:color="000000" w:sz="6"/>
-              <w:left w:val="single" w:color="000000" w:sz="6"/>
-              <w:bottom w:val="single" w:color="000000" w:sz="6"/>
-              <w:right w:val="single" w:color="000000" w:sz="6"/>
+              <w:top w:val="single" w:color="FF4F1F" w:sz="8"/>
+              <w:left w:val="single" w:color="CCCCCC" w:sz="4"/>
+              <w:bottom w:val="single" w:color="CCCCCC" w:sz="4"/>
+              <w:right w:val="single" w:color="CCCCCC" w:sz="4"/>
             </w:tcBorders>
             <w:tcMar>
               <w:top w:type="dxa" w:w="60"/>
@@ -1585,10 +1585,10 @@
           <w:tcPr>
             <w:tcW w:type="dxa" w:w="2000"/>
             <w:tcBorders>
-              <w:top w:val="single" w:color="000000" w:sz="6"/>
-              <w:left w:val="single" w:color="000000" w:sz="6"/>
-              <w:bottom w:val="single" w:color="000000" w:sz="6"/>
-              <w:right w:val="single" w:color="000000" w:sz="6"/>
+              <w:top w:val="single" w:color="FF4F1F" w:sz="8"/>
+              <w:left w:val="single" w:color="CCCCCC" w:sz="4"/>
+              <w:bottom w:val="single" w:color="CCCCCC" w:sz="4"/>
+              <w:right w:val="single" w:color="CCCCCC" w:sz="4"/>
             </w:tcBorders>
             <w:tcMar>
               <w:top w:type="dxa" w:w="60"/>
@@ -1614,10 +1614,10 @@
           <w:tcPr>
             <w:tcW w:type="dxa" w:w="2513"/>
             <w:tcBorders>
-              <w:top w:val="single" w:color="000000" w:sz="6"/>
-              <w:left w:val="single" w:color="000000" w:sz="6"/>
-              <w:bottom w:val="single" w:color="000000" w:sz="6"/>
-              <w:right w:val="single" w:color="000000" w:sz="6"/>
+              <w:top w:val="single" w:color="FF4F1F" w:sz="8"/>
+              <w:left w:val="single" w:color="CCCCCC" w:sz="4"/>
+              <w:bottom w:val="single" w:color="CCCCCC" w:sz="4"/>
+              <w:right w:val="single" w:color="CCCCCC" w:sz="4"/>
             </w:tcBorders>
             <w:tcMar>
               <w:top w:type="dxa" w:w="60"/>
@@ -1641,26 +1641,26 @@
           <w:tcPr>
             <w:tcW w:type="dxa" w:w="4513"/>
             <w:tcBorders>
-              <w:top w:val="single" w:color="000000" w:sz="6"/>
-              <w:left w:val="single" w:color="000000" w:sz="6"/>
-              <w:bottom w:val="single" w:color="000000" w:sz="6"/>
-              <w:right w:val="single" w:color="000000" w:sz="6"/>
-            </w:tcBorders>
-            <w:tcMar>
-              <w:top w:type="dxa" w:w="60"/>
-              <w:left w:type="dxa" w:w="80"/>
-              <w:bottom w:type="dxa" w:w="60"/>
-              <w:right w:type="dxa" w:w="80"/>
-            </w:tcMar>
-          </w:tcPr>
-          <w:p>
-            <w:r>
-              <w:rPr>
-                <w:rFonts w:ascii="Arial" w:cs="Arial" w:eastAsia="Arial" w:hAnsi="Arial"/>
-                <w:sz w:val="20"/>
-                <w:szCs w:val="20"/>
-              </w:rPr>
-              <w:t xml:space="preserve">Lab Advisor and co-PI. Scientific mentorship on Bayesian inference framing, experimental design for neurodivergent subgroup analysis, and co-authorship. Clinical recruitment via Royal Edinburgh Hospital and Dundee Ninewells collaborations. Can mobilise EEG and hyperscanning support through existing Edinburgh neuroscience network. PhD students working on Bayesian inference in ASD (Angeletos Chrysaitis) and computational psychiatry of anxiety (Ferrari) provide direct collaboration on neurodivergent intent-gap predictions</w:t>
+              <w:top w:val="single" w:color="FF4F1F" w:sz="8"/>
+              <w:left w:val="single" w:color="CCCCCC" w:sz="4"/>
+              <w:bottom w:val="single" w:color="CCCCCC" w:sz="4"/>
+              <w:right w:val="single" w:color="CCCCCC" w:sz="4"/>
+            </w:tcBorders>
+            <w:tcMar>
+              <w:top w:type="dxa" w:w="60"/>
+              <w:left w:type="dxa" w:w="80"/>
+              <w:bottom w:type="dxa" w:w="60"/>
+              <w:right w:type="dxa" w:w="80"/>
+            </w:tcMar>
+          </w:tcPr>
+          <w:p>
+            <w:r>
+              <w:rPr>
+                <w:rFonts w:ascii="Arial" w:cs="Arial" w:eastAsia="Arial" w:hAnsi="Arial"/>
+                <w:sz w:val="20"/>
+                <w:szCs w:val="20"/>
+              </w:rPr>
+              <w:t xml:space="preserve">Lab Advisor and co-PI. Scientific mentorship on Bayesian inference framing, experimental design for neurodivergent subgroup and trait-level analysis, and co-authorship. Clinical recruitment via Royal Edinburgh Hospital and Dundee Ninewells collaborations. Can mobilise EEG and hyperscanning support through existing Edinburgh neuroscience network. PhD students working on Bayesian inference in ASD (Angeletos Chrysaitis) and computational psychiatry of anxiety (Ferrari) provide direct collaboration on neurodivergent intent-gap predictions</w:t>
             </w:r>
           </w:p>
         </w:tc>
@@ -1704,7 +1704,7 @@
           <w:sz w:val="22"/>
           <w:szCs w:val="22"/>
         </w:rPr>
-        <w:t xml:space="preserve">Study 1b adds 100 new users under informed consent, with independent raters evaluating held-out messages. Neurodivergent participants (ASD, anxiety) will be recruited through the lab advisor’s clinical collaborations at Royal Edinburgh Hospital and Dundee Ninewells Hospital. If clinical recruitment requires additional ethics approval or extended timelines, the study will proceed with neurotypical participants who exhibit subclinical variation on standard trait measures (e.g., AQ-10, GAD-7), preserving the ability to test whether intent-gap profiles vary with trait-level differences on the autism and anxiety spectra. Personality data is local-first and encrypted (AES-256). If the EEG pilot proceeds, neural data is collected under joint ethics approval via the University of Edinburgh.</w:t>
+        <w:t xml:space="preserve">Study 1b adds 100 new users under informed consent, with independent raters evaluating held-out messages. Neurodivergent participants (ASD, anxiety) will be recruited through the lab advisor’s clinical collaborations at Royal Edinburgh Hospital and Dundee Ninewells Hospital. If clinical recruitment requires additional ethics approval or extended timelines, the study will proceed with neurotypical participants who exhibit subclinical variation on standard trait measures (e.g., AQ-10, GAD-7), preserving the ability to test whether intent-gap profiles vary with trait-level differences on the autism and anxiety spectra. Trait-level analyses allow us to test the same Bayesian predictions (e.g., weaker relational priors in high-AQ individuals, stronger threat priors in high-GAD individuals) without requiring categorical diagnoses, providing an initial bridge between laboratory theories and real-world communication data. Personality data is local-first and encrypted (AES-256). If the EEG pilot proceeds, neural data is collected under joint ethics approval via the University of Edinburgh.</w:t>
       </w:r>
     </w:p>
     <w:p>
@@ -1872,7 +1872,7 @@
           <w:sz w:val="22"/>
           <w:szCs w:val="22"/>
         </w:rPr>
-        <w:t xml:space="preserve">A second risk is a null H₁ result — still publishable as the first rigorous test of whether dyadic context improves intent prediction at this scale. A third risk is delayed ethics approval for clinical neurodivergent recruitment. This is mitigated by a fallback to neurotypical participants scored on subclinical trait measures (AQ-10, GAD-7), allowing the neurodivergent analysis to proceed as a continuous-trait study rather than a categorical-group comparison.</w:t>
+        <w:t xml:space="preserve">A second risk is a null H₁ result — still publishable as the first rigorous test of whether dyadic context improves intent prediction at this scale. A third risk is delayed ethics approval for clinical neurodivergent recruitment. This is mitigated by a two-tier design: Year-1 analyses proceed on trait-level variation (AQ-10, GAD-7) regardless of clinical timelines; categorical clinical comparisons are added as and when ethics and recruitment allow.</w:t>
       </w:r>
     </w:p>
     <w:p>
@@ -1958,15 +1958,15 @@
           <w:sz w:val="22"/>
           <w:szCs w:val="22"/>
         </w:rPr>
-        <w:t xml:space="preserve">3. Schrimpf, M., et al. (2021). </w:t>
-      </w:r>
-      <w:r>
-        <w:rPr>
-          <w:rFonts w:ascii="Arial" w:cs="Arial" w:eastAsia="Arial" w:hAnsi="Arial"/>
-          <w:sz w:val="22"/>
-          <w:szCs w:val="22"/>
-        </w:rPr>
-        <w:t xml:space="preserve">The neural architecture of language: Integrative modeling converges on predictive processing. PNAS, 118(45), e2105646118. — Brain-Score Language benchmark for neural plausibility assessment.</w:t>
+        <w:t xml:space="preserve">3. Pellicano, E., &amp; Burr, D. (2012). </w:t>
+      </w:r>
+      <w:r>
+        <w:rPr>
+          <w:rFonts w:ascii="Arial" w:cs="Arial" w:eastAsia="Arial" w:hAnsi="Arial"/>
+          <w:sz w:val="22"/>
+          <w:szCs w:val="22"/>
+        </w:rPr>
+        <w:t xml:space="preserve">When the world becomes ‘too real’: a Bayesian explanation of autistic perception. Trends in Cognitive Sciences, 16(10), 504–510. — Weakened perceptual priors in ASD; theoretical basis for the prediction that neurodivergent populations show elevated intent gaps.</w:t>
       </w:r>
     </w:p>
     <w:p>
@@ -2068,7 +2068,7 @@
           <w:sz w:val="22"/>
           <w:szCs w:val="22"/>
         </w:rPr>
-        <w:t xml:space="preserve">I have built and led AI teams at scale (KDD ’24/’25), with a working prototype deployed (dyadicmentalising.streamlit.app) and production experience in NLP and ML systems. Prof Peggy Sériès (Chair in Computational Psychiatry, University of Edinburgh) has agreed to serve as Lab Advisor, bringing expertise in Bayesian inference, clinical access via Royal Edinburgh Hospital and Dundee Ninewells, and an active research group working on ASD and anxiety. Her lab can mobilise EEG and hyperscanning support through the Edinburgh neuroscience network.</w:t>
+        <w:t xml:space="preserve">I have built and led AI teams at scale (KDD ’24/’25), with a working prototype deployed (dyadicmentalising.streamlit.app) demonstrating how identical messages produce different intent distributions across relational contexts, and production experience in NLP and ML systems. Prof Peggy Sériès (Chair in Computational Psychiatry, University of Edinburgh) has agreed to serve as Lab Advisor, bringing expertise in Bayesian inference, clinical access via Royal Edinburgh Hospital and Dundee Ninewells, and an active research group working on ASD and anxiety. Her lab can mobilise EEG and hyperscanning support through the Edinburgh neuroscience network.</w:t>
       </w:r>
     </w:p>
     <w:p>

</xml_diff>

<commit_message>
Proposal v4: final content tightening
- Add "why it matters" opening sentence to Section 1
- Remove trait-level foreshadow from Section 1 (lives in S2/S5/S7)
- Remove duplicate ARIA paragraph from Section 3 (kept in S9)
- Reorder hypotheses to H1, H2, H3, H4 (sequential)
- Replace "browser extension" with "intervention delivery" in People table

Co-Authored-By: Claude Opus 4.6 (1M context) <noreply@anthropic.com>
</commit_message>
<xml_diff>
--- a/_bmad-output/planning-artifacts/encode-application/Encode-Fellow-Proposal-Snehal-Nair-2026.docx
+++ b/_bmad-output/planning-artifacts/encode-application/Encode-Fellow-Proposal-Snehal-Nair-2026.docx
@@ -102,7 +102,7 @@
           <w:sz w:val="22"/>
           <w:szCs w:val="22"/>
         </w:rPr>
-        <w:t xml:space="preserve">Ambiguous emotional stimuli are threat-tagged via subcortical processing (LeDoux, 1996) before higher-order language and mentalising systems resolve intent. In digital text — where prosody, facial expression, and physical context are absent — this timing asymmetry makes misunderstanding especially likely.</w:t>
+        <w:t xml:space="preserve">Miscommunication is among the primary drivers of relationship breakdown, workplace conflict, and therapeutic failure — yet we have no scientific instrument to measure it. The biological basis is well-established: ambiguous emotional stimuli are threat-tagged via subcortical processing (LeDoux, 1996) before higher-order language and mentalising systems resolve intent. In digital text — where prosody, facial expression, and physical context are absent — this timing asymmetry makes misunderstanding especially likely.</w:t>
       </w:r>
     </w:p>
     <w:p>
@@ -115,7 +115,7 @@
           <w:sz w:val="22"/>
           <w:szCs w:val="22"/>
         </w:rPr>
-        <w:t xml:space="preserve">To our knowledge, no published NLP system models intent as a dyadic phenomenon conditioned on relational history. Sentiment classifiers measure tone; emotion recognition systems measure affective expression. Neither asks what a person most likely meant, given who they are and who they are talking to. The same message can carry a different intent distribution depending on relationship type, history, and context. This divergence may be particularly pronounced in neurodivergent populations: computational psychiatry research suggests that individuals with ASD may form weaker relational priors, while those with anxiety may form stronger threat priors (Sériès, 2020), predicting systematically different intent-gap profiles. Where full clinical recruitment is not yet feasible, we treat autistic and anxious traits as continuous dimensions in a neurotypical sample, testing the same predictions at the trait level (AQ-10, GAD-7). The central question is whether conditioning on dyadic context and providing closed-loop feedback measurably improves intent prediction and reduces miscommunication — and whether the effect varies with neurodivergent traits and clinical status.</w:t>
+        <w:t xml:space="preserve">To our knowledge, no published NLP system models intent as a dyadic phenomenon conditioned on relational history. Sentiment classifiers measure tone; emotion recognition systems measure affective expression. Neither asks what a person most likely meant, given who they are and who they are talking to. The same message can carry a different intent distribution depending on relationship type, history, and context. This divergence may be particularly pronounced in neurodivergent populations: computational psychiatry research suggests that individuals with ASD may form weaker relational priors, while those with anxiety may form stronger threat priors (Sériès, 2020), predicting systematically different intent-gap profiles. The central question is whether conditioning on dyadic context and providing closed-loop feedback measurably improves intent prediction and reduces miscommunication — and whether the effect varies with neurodivergent traits and clinical status.</w:t>
       </w:r>
     </w:p>
     <w:p>
@@ -371,15 +371,15 @@
           <w:sz w:val="22"/>
           <w:szCs w:val="22"/>
         </w:rPr>
-        <w:t xml:space="preserve">Cold-start ablation (H₄): </w:t>
-      </w:r>
-      <w:r>
-        <w:rPr>
-          <w:rFonts w:ascii="Arial" w:cs="Arial" w:eastAsia="Arial" w:hAnsi="Arial"/>
-          <w:sz w:val="22"/>
-          <w:szCs w:val="22"/>
-        </w:rPr>
-        <w:t xml:space="preserve">Personality context improves Day 1 accuracy before dyadic history accumulates (100 users randomised 1:1).</w:t>
+        <w:t xml:space="preserve">Behavioural (H₂): </w:t>
+      </w:r>
+      <w:r>
+        <w:rPr>
+          <w:rFonts w:ascii="Arial" w:cs="Arial" w:eastAsia="Arial" w:hAnsi="Arial"/>
+          <w:sz w:val="22"/>
+          <w:szCs w:val="22"/>
+        </w:rPr>
+        <w:t xml:space="preserve">60-day feedback reduces divergence scores (within-subjects pre/post, Wilcoxon signed-rank).</w:t>
       </w:r>
     </w:p>
     <w:p>
@@ -399,15 +399,15 @@
           <w:sz w:val="22"/>
           <w:szCs w:val="22"/>
         </w:rPr>
-        <w:t xml:space="preserve">Behavioural (H₂): </w:t>
-      </w:r>
-      <w:r>
-        <w:rPr>
-          <w:rFonts w:ascii="Arial" w:cs="Arial" w:eastAsia="Arial" w:hAnsi="Arial"/>
-          <w:sz w:val="22"/>
-          <w:szCs w:val="22"/>
-        </w:rPr>
-        <w:t xml:space="preserve">60-day feedback reduces divergence scores (within-subjects pre/post, Wilcoxon signed-rank).</w:t>
+        <w:t xml:space="preserve">Neural (H₃, stretch): </w:t>
+      </w:r>
+      <w:r>
+        <w:rPr>
+          <w:rFonts w:ascii="Arial" w:cs="Arial" w:eastAsia="Arial" w:hAnsi="Arial"/>
+          <w:sz w:val="22"/>
+          <w:szCs w:val="22"/>
+        </w:rPr>
+        <w:t xml:space="preserve">60-day feedback increases theta-band inter-brain synchrony (EEG hyperscanning, N=20–24, pre/post, via Edinburgh neuroscience network coordinated by Sériès lab).</w:t>
       </w:r>
     </w:p>
     <w:p>
@@ -427,15 +427,15 @@
           <w:sz w:val="22"/>
           <w:szCs w:val="22"/>
         </w:rPr>
-        <w:t xml:space="preserve">Neural (H₃, stretch): </w:t>
-      </w:r>
-      <w:r>
-        <w:rPr>
-          <w:rFonts w:ascii="Arial" w:cs="Arial" w:eastAsia="Arial" w:hAnsi="Arial"/>
-          <w:sz w:val="22"/>
-          <w:szCs w:val="22"/>
-        </w:rPr>
-        <w:t xml:space="preserve">60-day feedback increases theta-band inter-brain synchrony (EEG hyperscanning, N=20–24, pre/post, via Edinburgh neuroscience network coordinated by Sériès lab).</w:t>
+        <w:t xml:space="preserve">Cold-start ablation (H₄): </w:t>
+      </w:r>
+      <w:r>
+        <w:rPr>
+          <w:rFonts w:ascii="Arial" w:cs="Arial" w:eastAsia="Arial" w:hAnsi="Arial"/>
+          <w:sz w:val="22"/>
+          <w:szCs w:val="22"/>
+        </w:rPr>
+        <w:t xml:space="preserve">Personality context improves Day 1 accuracy before dyadic history accumulates (100 users randomised 1:1).</w:t>
       </w:r>
     </w:p>
     <w:p>
@@ -477,65 +477,6 @@
           <w:szCs w:val="22"/>
         </w:rPr>
         <w:t xml:space="preserve">The scientific contribution is a new measurement construct — the divergence between sender-intent and perceived-intent distributions — and a new conditioning signal: dyadic relational context. The open-source dataset and trained model (HuggingFace, Apache 2.0) will support follow-on research in pragmatic inference, social cognition, and human-AI communication. If the intent gap proves measurable and reducible, the open-source instrument could anchor a Focused Research Organisation dedicated to communication measurement. For computational psychiatry, the same tools provide a controlled way to study how autistic and anxious traits shape intent inference, potentially informing future clinical interventions even if Year-1 work remains pre-clinical.</w:t>
-      </w:r>
-    </w:p>
-    <w:p>
-      <w:pPr>
-        <w:spacing w:after="120"/>
-      </w:pPr>
-      <w:r>
-        <w:rPr>
-          <w:rFonts w:ascii="Arial" w:cs="Arial" w:eastAsia="Arial" w:hAnsi="Arial"/>
-          <w:b/>
-          <w:bCs/>
-          <w:sz w:val="22"/>
-          <w:szCs w:val="22"/>
-        </w:rPr>
-        <w:t xml:space="preserve">ARIA alignment: </w:t>
-      </w:r>
-      <w:r>
-        <w:rPr>
-          <w:rFonts w:ascii="Arial" w:cs="Arial" w:eastAsia="Arial" w:hAnsi="Arial"/>
-          <w:sz w:val="22"/>
-          <w:szCs w:val="22"/>
-        </w:rPr>
-        <w:t xml:space="preserve">the project advances </w:t>
-      </w:r>
-      <w:r>
-        <w:rPr>
-          <w:rFonts w:ascii="Arial" w:cs="Arial" w:eastAsia="Arial" w:hAnsi="Arial"/>
-          <w:b/>
-          <w:bCs/>
-          <w:sz w:val="22"/>
-          <w:szCs w:val="22"/>
-        </w:rPr>
-        <w:t xml:space="preserve">Scalable Neural Interfaces</w:t>
-      </w:r>
-      <w:r>
-        <w:rPr>
-          <w:rFonts w:ascii="Arial" w:cs="Arial" w:eastAsia="Arial" w:hAnsi="Arial"/>
-          <w:sz w:val="22"/>
-          <w:szCs w:val="22"/>
-        </w:rPr>
-        <w:t xml:space="preserve"> through computational tools that model human mentalising, and points toward </w:t>
-      </w:r>
-      <w:r>
-        <w:rPr>
-          <w:rFonts w:ascii="Arial" w:cs="Arial" w:eastAsia="Arial" w:hAnsi="Arial"/>
-          <w:b/>
-          <w:bCs/>
-          <w:sz w:val="22"/>
-          <w:szCs w:val="22"/>
-        </w:rPr>
-        <w:t xml:space="preserve">Collective Flourishing</w:t>
-      </w:r>
-      <w:r>
-        <w:rPr>
-          <w:rFonts w:ascii="Arial" w:cs="Arial" w:eastAsia="Arial" w:hAnsi="Arial"/>
-          <w:sz w:val="22"/>
-          <w:szCs w:val="22"/>
-        </w:rPr>
-        <w:t xml:space="preserve"> by making understanding measurable rather than extractive.</w:t>
       </w:r>
     </w:p>
     <w:p>
@@ -1575,7 +1516,7 @@
                 <w:sz w:val="20"/>
                 <w:szCs w:val="20"/>
               </w:rPr>
-              <w:t xml:space="preserve">Fellow — dataset pipeline, model training, annotation tooling, biographical intake instrument, browser extension, analysis code, reproducibility infrastructure (DVC, HuggingFace Hub, OpenNeuro)</w:t>
+              <w:t xml:space="preserve">Fellow — dataset pipeline, model training, annotation tooling, biographical intake instrument, intervention delivery, analysis code, reproducibility infrastructure (DVC, HuggingFace Hub, OpenNeuro)</w:t>
             </w:r>
           </w:p>
         </w:tc>

</xml_diff>